<commit_message>
Ancre les messages sur le bord des barres d'activation
Défaut systématique du diagramme de séquence, visible sur chaque flèche une fois
la zone agrandie : les messages partaient du centre de la ligne de vie, donc de
l'intérieur de la barre d'activation, et la traversaient visiblement. Le trait
semblait naître au milieu de l'objet plutôt qu'à sa surface.

Les extrémités sont désormais décalées d'une demi-largeur de barre dans le sens
du message : départ sur le bord de l'émetteur, pointe sur le bord du
destinataire. La demi-largeur devient une constante, pour que la barre et les
messages ne puissent plus diverger.

La pointe des messages réflexifs s'arrête elle aussi exactement sur le bord :
elle empiétait sur la barre à un endroit, s'en écartait à un autre.

Co-Authored-By: Claude Opus 5 (1M context) <noreply@anthropic.com>
Claude-Session: https://claude.ai/code/session_01P8zTuhbwT2ARamgkK3baLv
</commit_message>
<xml_diff>
--- a/docs/rapport-technique-puls-events-rag.docx
+++ b/docs/rapport-technique-puls-events-rag.docx
@@ -253,7 +253,7 @@
                 <w:color w:val="3C4757"/>
                 <w:sz w:val="18"/>
               </w:rPr>
-              <w:t>35 commits · 28 modules Python · 86 tests</w:t>
+              <w:t>37 commits · 28 modules Python · 86 tests</w:t>
             </w:r>
           </w:p>
         </w:tc>
@@ -10813,7 +10813,7 @@
           <w:color w:val="3C4757"/>
           <w:sz w:val="21"/>
         </w:rPr>
-        <w:t>github.com/traoreteddy/openclassroom-p7 — 35 commits, une branche par étape, fusionnées par des commits de merge explicites.</w:t>
+        <w:t>github.com/traoreteddy/openclassroom-p7 — 37 commits, une branche par étape, fusionnées par des commits de merge explicites.</w:t>
       </w:r>
     </w:p>
     <w:p>

</xml_diff>

<commit_message>
Régénère le support et le rapport
Chiffres à cette génération : 41 commits, 34 modules Python, 95 tests,
22 contrôles de cohérence, 16 scénarios de robustesse.

Co-Authored-By: Claude Opus 5 (1M context) <noreply@anthropic.com>
Claude-Session: https://claude.ai/code/session_01P8zTuhbwT2ARamgkK3baLv
</commit_message>
<xml_diff>
--- a/docs/rapport-technique-puls-events-rag.docx
+++ b/docs/rapport-technique-puls-events-rag.docx
@@ -253,7 +253,7 @@
                 <w:color w:val="3C4757"/>
                 <w:sz w:val="18"/>
               </w:rPr>
-              <w:t>39 commits · 34 modules Python · 95 tests</w:t>
+              <w:t>41 commits · 34 modules Python · 95 tests</w:t>
             </w:r>
           </w:p>
         </w:tc>
@@ -10872,7 +10872,7 @@
           <w:color w:val="3C4757"/>
           <w:sz w:val="21"/>
         </w:rPr>
-        <w:t>github.com/traoreteddy/openclassroom-p7 — 39 commits, une branche par étape, fusionnées par des commits de merge explicites.</w:t>
+        <w:t>github.com/traoreteddy/openclassroom-p7 — 41 commits, une branche par étape, fusionnées par des commits de merge explicites.</w:t>
       </w:r>
     </w:p>
     <w:p>

</xml_diff>

<commit_message>
Aligne les coupes d'interface requise
Les coupes de vectorstore.embeddings et de rag.chain avaient été rapprochées de
leur composant pour laisser passer le tronc du connecteur IModeles. Elles se
retrouvaient de ce fait dessinées à cheval sur la bordure en pointillés de leur
paquet, et décalées par rapport à celle de IEvenements — trois coupes, trois
abscisses différentes.

Les trois partagent désormais la même longueur de tige, donc la même abscisse.
Elles sont dégagées des bordures, et la colonne des interfaces se lit d'un seul
regard.

Le tronc du connecteur passe à leur gauche sans les traverser : la contrainte
qui avait motivé le rapprochement n'existe plus depuis que le tronc part de la
bille elle-même plutôt que de bifurquer en amont.

Chiffres régénérés : 50 commits, 35 modules, 101 tests.

Co-Authored-By: Claude Opus 5 (1M context) <noreply@anthropic.com>
Claude-Session: https://claude.ai/code/session_01P8zTuhbwT2ARamgkK3baLv
</commit_message>
<xml_diff>
--- a/docs/rapport-technique-puls-events-rag.docx
+++ b/docs/rapport-technique-puls-events-rag.docx
@@ -253,7 +253,7 @@
                 <w:color w:val="3C4757"/>
                 <w:sz w:val="18"/>
               </w:rPr>
-              <w:t>49 commits · 35 modules Python · 101 tests</w:t>
+              <w:t>50 commits · 35 modules Python · 101 tests</w:t>
             </w:r>
           </w:p>
         </w:tc>
@@ -12541,7 +12541,7 @@
           <w:color w:val="3C4757"/>
           <w:sz w:val="21"/>
         </w:rPr>
-        <w:t>github.com/traoreteddy/openclassroom-p7 — 49 commits, une branche par étape, fusionnées par des commits de merge explicites.</w:t>
+        <w:t>github.com/traoreteddy/openclassroom-p7 — 50 commits, une branche par étape, fusionnées par des commits de merge explicites.</w:t>
       </w:r>
     </w:p>
     <w:p>

</xml_diff>